<commit_message>
daily_learning_sync: 2026-06-23 - 지식베이스 및 보고서 업데이트
</commit_message>
<xml_diff>
--- a/report/학습결과_보고서.docx
+++ b/report/학습결과_보고서.docx
@@ -715,68 +715,6 @@
           </w:tcPr>
           <w:p>
             <w:r>
-              <w:t>Interpack_2023_출장보고서_플랜트_구매(23.05.18_REV0)</w:t>
-            </w:r>
-          </w:p>
-        </w:tc>
-        <w:tc>
-          <w:tcPr>
-            <w:tcW w:type="dxa" w:w="1440"/>
-          </w:tcPr>
-          <w:p>
-            <w:r>
-              <w:t>로컬 소머즈 문서고</w:t>
-            </w:r>
-          </w:p>
-        </w:tc>
-        <w:tc>
-          <w:tcPr>
-            <w:tcW w:type="dxa" w:w="1440"/>
-          </w:tcPr>
-          <w:p>
-            <w:r>
-              <w:t>2023</w:t>
-            </w:r>
-          </w:p>
-        </w:tc>
-        <w:tc>
-          <w:tcPr>
-            <w:tcW w:type="dxa" w:w="1440"/>
-          </w:tcPr>
-          <w:p>
-            <w:r>
-              <w:t>기술 설계 문서</w:t>
-            </w:r>
-          </w:p>
-        </w:tc>
-        <w:tc>
-          <w:tcPr>
-            <w:tcW w:type="dxa" w:w="1440"/>
-          </w:tcPr>
-          <w:p>
-            <w:r>
-              <w:t>★★★★☆</w:t>
-            </w:r>
-          </w:p>
-        </w:tc>
-      </w:tr>
-      <w:tr>
-        <w:tc>
-          <w:tcPr>
-            <w:tcW w:type="dxa" w:w="1440"/>
-          </w:tcPr>
-          <w:p>
-            <w:r>
-              <w:t>11</w:t>
-            </w:r>
-          </w:p>
-        </w:tc>
-        <w:tc>
-          <w:tcPr>
-            <w:tcW w:type="dxa" w:w="1440"/>
-          </w:tcPr>
-          <w:p>
-            <w:r>
               <w:t>KoMA</w:t>
             </w:r>
           </w:p>
@@ -829,7 +767,7 @@
           </w:tcPr>
           <w:p>
             <w:r>
-              <w:t>12</w:t>
+              <w:t>11</w:t>
             </w:r>
           </w:p>
         </w:tc>
@@ -891,7 +829,7 @@
           </w:tcPr>
           <w:p>
             <w:r>
-              <w:t>13</w:t>
+              <w:t>12</w:t>
             </w:r>
           </w:p>
         </w:tc>
@@ -953,7 +891,7 @@
           </w:tcPr>
           <w:p>
             <w:r>
-              <w:t>14</w:t>
+              <w:t>13</w:t>
             </w:r>
           </w:p>
         </w:tc>
@@ -1015,7 +953,7 @@
           </w:tcPr>
           <w:p>
             <w:r>
-              <w:t>15</w:t>
+              <w:t>14</w:t>
             </w:r>
           </w:p>
         </w:tc>
@@ -1077,69 +1015,7 @@
           </w:tcPr>
           <w:p>
             <w:r>
-              <w:t>16</w:t>
-            </w:r>
-          </w:p>
-        </w:tc>
-        <w:tc>
-          <w:tcPr>
-            <w:tcW w:type="dxa" w:w="1440"/>
-          </w:tcPr>
-          <w:p>
-            <w:r>
-              <w:t>NVIDIA_GTC_2026_전시회_참관_보고서</w:t>
-            </w:r>
-          </w:p>
-        </w:tc>
-        <w:tc>
-          <w:tcPr>
-            <w:tcW w:type="dxa" w:w="1440"/>
-          </w:tcPr>
-          <w:p>
-            <w:r>
-              <w:t>로컬 소머즈 문서고</w:t>
-            </w:r>
-          </w:p>
-        </w:tc>
-        <w:tc>
-          <w:tcPr>
-            <w:tcW w:type="dxa" w:w="1440"/>
-          </w:tcPr>
-          <w:p>
-            <w:r>
-              <w:t>2026</w:t>
-            </w:r>
-          </w:p>
-        </w:tc>
-        <w:tc>
-          <w:tcPr>
-            <w:tcW w:type="dxa" w:w="1440"/>
-          </w:tcPr>
-          <w:p>
-            <w:r>
-              <w:t>기술 설계 문서</w:t>
-            </w:r>
-          </w:p>
-        </w:tc>
-        <w:tc>
-          <w:tcPr>
-            <w:tcW w:type="dxa" w:w="1440"/>
-          </w:tcPr>
-          <w:p>
-            <w:r>
-              <w:t>★★★★☆</w:t>
-            </w:r>
-          </w:p>
-        </w:tc>
-      </w:tr>
-      <w:tr>
-        <w:tc>
-          <w:tcPr>
-            <w:tcW w:type="dxa" w:w="1440"/>
-          </w:tcPr>
-          <w:p>
-            <w:r>
-              <w:t>17</w:t>
+              <w:t>15</w:t>
             </w:r>
           </w:p>
         </w:tc>
@@ -1170,440 +1046,6 @@
           <w:p>
             <w:r>
               <w:t>2015</w:t>
-            </w:r>
-          </w:p>
-        </w:tc>
-        <w:tc>
-          <w:tcPr>
-            <w:tcW w:type="dxa" w:w="1440"/>
-          </w:tcPr>
-          <w:p>
-            <w:r>
-              <w:t>학술 논문</w:t>
-            </w:r>
-          </w:p>
-        </w:tc>
-        <w:tc>
-          <w:tcPr>
-            <w:tcW w:type="dxa" w:w="1440"/>
-          </w:tcPr>
-          <w:p>
-            <w:r>
-              <w:t>★★★★☆</w:t>
-            </w:r>
-          </w:p>
-        </w:tc>
-      </w:tr>
-      <w:tr>
-        <w:tc>
-          <w:tcPr>
-            <w:tcW w:type="dxa" w:w="1440"/>
-          </w:tcPr>
-          <w:p>
-            <w:r>
-              <w:t>18</w:t>
-            </w:r>
-          </w:p>
-        </w:tc>
-        <w:tc>
-          <w:tcPr>
-            <w:tcW w:type="dxa" w:w="1440"/>
-          </w:tcPr>
-          <w:p>
-            <w:r>
-              <w:t>제1회_휴머노이드_테크콘(1st_Humanoid_Techcon)_주제별_핵심_요약_보고서</w:t>
-            </w:r>
-          </w:p>
-        </w:tc>
-        <w:tc>
-          <w:tcPr>
-            <w:tcW w:type="dxa" w:w="1440"/>
-          </w:tcPr>
-          <w:p>
-            <w:r>
-              <w:t>특허청</w:t>
-            </w:r>
-          </w:p>
-        </w:tc>
-        <w:tc>
-          <w:tcPr>
-            <w:tcW w:type="dxa" w:w="1440"/>
-          </w:tcPr>
-          <w:p>
-            <w:r>
-              <w:t>2025</w:t>
-            </w:r>
-          </w:p>
-        </w:tc>
-        <w:tc>
-          <w:tcPr>
-            <w:tcW w:type="dxa" w:w="1440"/>
-          </w:tcPr>
-          <w:p>
-            <w:r>
-              <w:t>기술 설계 문서</w:t>
-            </w:r>
-          </w:p>
-        </w:tc>
-        <w:tc>
-          <w:tcPr>
-            <w:tcW w:type="dxa" w:w="1440"/>
-          </w:tcPr>
-          <w:p>
-            <w:r>
-              <w:t>★★★★☆</w:t>
-            </w:r>
-          </w:p>
-        </w:tc>
-      </w:tr>
-      <w:tr>
-        <w:tc>
-          <w:tcPr>
-            <w:tcW w:type="dxa" w:w="1440"/>
-          </w:tcPr>
-          <w:p>
-            <w:r>
-              <w:t>19</w:t>
-            </w:r>
-          </w:p>
-        </w:tc>
-        <w:tc>
-          <w:tcPr>
-            <w:tcW w:type="dxa" w:w="1440"/>
-          </w:tcPr>
-          <w:p>
-            <w:r>
-              <w:t>2026 인터팩 참관 내용(NSE)</w:t>
-            </w:r>
-          </w:p>
-        </w:tc>
-        <w:tc>
-          <w:tcPr>
-            <w:tcW w:type="dxa" w:w="1440"/>
-          </w:tcPr>
-          <w:p>
-            <w:r>
-              <w:t>로컬 소머즈 문서고</w:t>
-            </w:r>
-          </w:p>
-        </w:tc>
-        <w:tc>
-          <w:tcPr>
-            <w:tcW w:type="dxa" w:w="1440"/>
-          </w:tcPr>
-          <w:p>
-            <w:r>
-              <w:t>2025</w:t>
-            </w:r>
-          </w:p>
-        </w:tc>
-        <w:tc>
-          <w:tcPr>
-            <w:tcW w:type="dxa" w:w="1440"/>
-          </w:tcPr>
-          <w:p>
-            <w:r>
-              <w:t>정부·공공기관 보고서</w:t>
-            </w:r>
-          </w:p>
-        </w:tc>
-        <w:tc>
-          <w:tcPr>
-            <w:tcW w:type="dxa" w:w="1440"/>
-          </w:tcPr>
-          <w:p>
-            <w:r>
-              <w:t>★★★★☆</w:t>
-            </w:r>
-          </w:p>
-        </w:tc>
-      </w:tr>
-      <w:tr>
-        <w:tc>
-          <w:tcPr>
-            <w:tcW w:type="dxa" w:w="1440"/>
-          </w:tcPr>
-          <w:p>
-            <w:r>
-              <w:t>20</w:t>
-            </w:r>
-          </w:p>
-        </w:tc>
-        <w:tc>
-          <w:tcPr>
-            <w:tcW w:type="dxa" w:w="1440"/>
-          </w:tcPr>
-          <w:p>
-            <w:r>
-              <w:t>MCP</w:t>
-            </w:r>
-          </w:p>
-        </w:tc>
-        <w:tc>
-          <w:tcPr>
-            <w:tcW w:type="dxa" w:w="1440"/>
-          </w:tcPr>
-          <w:p>
-            <w:r>
-              <w:t>로컬 소머즈 문서고</w:t>
-            </w:r>
-          </w:p>
-        </w:tc>
-        <w:tc>
-          <w:tcPr>
-            <w:tcW w:type="dxa" w:w="1440"/>
-          </w:tcPr>
-          <w:p>
-            <w:r>
-              <w:t>2024</w:t>
-            </w:r>
-          </w:p>
-        </w:tc>
-        <w:tc>
-          <w:tcPr>
-            <w:tcW w:type="dxa" w:w="1440"/>
-          </w:tcPr>
-          <w:p>
-            <w:r>
-              <w:t>기술 설계 문서</w:t>
-            </w:r>
-          </w:p>
-        </w:tc>
-        <w:tc>
-          <w:tcPr>
-            <w:tcW w:type="dxa" w:w="1440"/>
-          </w:tcPr>
-          <w:p>
-            <w:r>
-              <w:t>★★★★☆</w:t>
-            </w:r>
-          </w:p>
-        </w:tc>
-      </w:tr>
-      <w:tr>
-        <w:tc>
-          <w:tcPr>
-            <w:tcW w:type="dxa" w:w="1440"/>
-          </w:tcPr>
-          <w:p>
-            <w:r>
-              <w:t>21</w:t>
-            </w:r>
-          </w:p>
-        </w:tc>
-        <w:tc>
-          <w:tcPr>
-            <w:tcW w:type="dxa" w:w="1440"/>
-          </w:tcPr>
-          <w:p>
-            <w:r>
-              <w:t>NVIDIA_GTC_2026_시행계획서</w:t>
-            </w:r>
-          </w:p>
-        </w:tc>
-        <w:tc>
-          <w:tcPr>
-            <w:tcW w:type="dxa" w:w="1440"/>
-          </w:tcPr>
-          <w:p>
-            <w:r>
-              <w:t>로컬 소머즈 문서고</w:t>
-            </w:r>
-          </w:p>
-        </w:tc>
-        <w:tc>
-          <w:tcPr>
-            <w:tcW w:type="dxa" w:w="1440"/>
-          </w:tcPr>
-          <w:p>
-            <w:r>
-              <w:t>2026</w:t>
-            </w:r>
-          </w:p>
-        </w:tc>
-        <w:tc>
-          <w:tcPr>
-            <w:tcW w:type="dxa" w:w="1440"/>
-          </w:tcPr>
-          <w:p>
-            <w:r>
-              <w:t>학술 논문</w:t>
-            </w:r>
-          </w:p>
-        </w:tc>
-        <w:tc>
-          <w:tcPr>
-            <w:tcW w:type="dxa" w:w="1440"/>
-          </w:tcPr>
-          <w:p>
-            <w:r>
-              <w:t>★★★★☆</w:t>
-            </w:r>
-          </w:p>
-        </w:tc>
-      </w:tr>
-      <w:tr>
-        <w:tc>
-          <w:tcPr>
-            <w:tcW w:type="dxa" w:w="1440"/>
-          </w:tcPr>
-          <w:p>
-            <w:r>
-              <w:t>22</w:t>
-            </w:r>
-          </w:p>
-        </w:tc>
-        <w:tc>
-          <w:tcPr>
-            <w:tcW w:type="dxa" w:w="1440"/>
-          </w:tcPr>
-          <w:p>
-            <w:r>
-              <w:t>로봇전문가로또</w:t>
-            </w:r>
-          </w:p>
-        </w:tc>
-        <w:tc>
-          <w:tcPr>
-            <w:tcW w:type="dxa" w:w="1440"/>
-          </w:tcPr>
-          <w:p>
-            <w:r>
-              <w:t>로컬 소머즈 문서고</w:t>
-            </w:r>
-          </w:p>
-        </w:tc>
-        <w:tc>
-          <w:tcPr>
-            <w:tcW w:type="dxa" w:w="1440"/>
-          </w:tcPr>
-          <w:p>
-            <w:r>
-              <w:t>2024</w:t>
-            </w:r>
-          </w:p>
-        </w:tc>
-        <w:tc>
-          <w:tcPr>
-            <w:tcW w:type="dxa" w:w="1440"/>
-          </w:tcPr>
-          <w:p>
-            <w:r>
-              <w:t>학술 논문</w:t>
-            </w:r>
-          </w:p>
-        </w:tc>
-        <w:tc>
-          <w:tcPr>
-            <w:tcW w:type="dxa" w:w="1440"/>
-          </w:tcPr>
-          <w:p>
-            <w:r>
-              <w:t>★★★★☆</w:t>
-            </w:r>
-          </w:p>
-        </w:tc>
-      </w:tr>
-      <w:tr>
-        <w:tc>
-          <w:tcPr>
-            <w:tcW w:type="dxa" w:w="1440"/>
-          </w:tcPr>
-          <w:p>
-            <w:r>
-              <w:t>23</w:t>
-            </w:r>
-          </w:p>
-        </w:tc>
-        <w:tc>
-          <w:tcPr>
-            <w:tcW w:type="dxa" w:w="1440"/>
-          </w:tcPr>
-          <w:p>
-            <w:r>
-              <w:t>문서검색 전문가</w:t>
-            </w:r>
-          </w:p>
-        </w:tc>
-        <w:tc>
-          <w:tcPr>
-            <w:tcW w:type="dxa" w:w="1440"/>
-          </w:tcPr>
-          <w:p>
-            <w:r>
-              <w:t>학술지 DB</w:t>
-            </w:r>
-          </w:p>
-        </w:tc>
-        <w:tc>
-          <w:tcPr>
-            <w:tcW w:type="dxa" w:w="1440"/>
-          </w:tcPr>
-          <w:p>
-            <w:r>
-              <w:t>2026</w:t>
-            </w:r>
-          </w:p>
-        </w:tc>
-        <w:tc>
-          <w:tcPr>
-            <w:tcW w:type="dxa" w:w="1440"/>
-          </w:tcPr>
-          <w:p>
-            <w:r>
-              <w:t>학술 논문</w:t>
-            </w:r>
-          </w:p>
-        </w:tc>
-        <w:tc>
-          <w:tcPr>
-            <w:tcW w:type="dxa" w:w="1440"/>
-          </w:tcPr>
-          <w:p>
-            <w:r>
-              <w:t>★★★★☆</w:t>
-            </w:r>
-          </w:p>
-        </w:tc>
-      </w:tr>
-      <w:tr>
-        <w:tc>
-          <w:tcPr>
-            <w:tcW w:type="dxa" w:w="1440"/>
-          </w:tcPr>
-          <w:p>
-            <w:r>
-              <w:t>24</w:t>
-            </w:r>
-          </w:p>
-        </w:tc>
-        <w:tc>
-          <w:tcPr>
-            <w:tcW w:type="dxa" w:w="1440"/>
-          </w:tcPr>
-          <w:p>
-            <w:r>
-              <w:t>구조 개편 테스트에 관한 산업 동향 및 학술 보고서</w:t>
-            </w:r>
-          </w:p>
-        </w:tc>
-        <w:tc>
-          <w:tcPr>
-            <w:tcW w:type="dxa" w:w="1440"/>
-          </w:tcPr>
-          <w:p>
-            <w:r>
-              <w:t>한국학술지인용색인 (KCI)</w:t>
-            </w:r>
-          </w:p>
-        </w:tc>
-        <w:tc>
-          <w:tcPr>
-            <w:tcW w:type="dxa" w:w="1440"/>
-          </w:tcPr>
-          <w:p>
-            <w:r>
-              <w:t>2024</w:t>
             </w:r>
           </w:p>
         </w:tc>
@@ -2129,60 +1571,6 @@
         <w:pStyle w:val="Heading2"/>
       </w:pPr>
       <w:r>
-        <w:t>■ Interpack_2023_출장보고서_플랜트_구매(23.05.18_REV0)</w:t>
-      </w:r>
-    </w:p>
-    <w:p>
-      <w:r>
-        <w:rPr>
-          <w:b/>
-        </w:rPr>
-        <w:t xml:space="preserve">• 출처 및 유형: </w:t>
-      </w:r>
-      <w:r>
-        <w:t>로컬 소머즈 문서고 (2023) | 기술 설계 문서</w:t>
-        <w:br/>
-      </w:r>
-      <w:r>
-        <w:rPr>
-          <w:b/>
-        </w:rPr>
-        <w:t>• 핵심 내용 요약:</w:t>
-        <w:br/>
-      </w:r>
-      <w:r>
-        <w:t xml:space="preserve">  InterPack 2023 - 참관보고서- NONGSHIM ENGINEERING  InterPack 2023 전시회참관계획  Interpack 2023 √ InterPack 2023 전시회참관계획 NSE : 공원욱과장 NS : 박은지선임, 우민섭주임 농심기획: 임한미팀장, 김윤형차장 율촌화학김홍석파트장(월간포장패키...</w:t>
-        <w:br/>
-      </w:r>
-      <w:r>
-        <w:rPr>
-          <w:b/>
-        </w:rPr>
-        <w:t>• AI 학습용 핵심 Q&amp;A:</w:t>
-        <w:br/>
-      </w:r>
-      <w:r>
-        <w:t xml:space="preserve">  - Q: 'Interpack_2023_출장보고서_플랜트_구매(23.05.18_REV0)' 문서의 주요 목적과 핵심 요약은 무엇입니까?</w:t>
-        <w:br/>
-      </w:r>
-      <w:r>
-        <w:t xml:space="preserve">    A: 본 문서는 '기술 설계 문서' 유형으로 분류되며, 주요 요약 내용은 다음과 같습니다: InterPack 2023 - 참관보고서- NONGSHIM ENGINEERING  InterPack 2023 전시회참관계획  Interpack 2023 √ InterPack 2023 전시회참관계획 NSE : 공원욱과장 NS : 박은지선임, 우민섭주임 농심기획: 임한미팀장, 김윤형차장 율촌화학김홍석파트장(월간포장패키...</w:t>
-        <w:br/>
-      </w:r>
-      <w:r>
-        <w:t xml:space="preserve">  - Q: 'Interpack_2023_출장보고서_플랜트_구매(23.05.18_REV0)' 문서에서 도출할 수 있는 실무 적용 포인트는 무엇입니까?</w:t>
-        <w:br/>
-      </w:r>
-      <w:r>
-        <w:t xml:space="preserve">    A: 문서의 텍스트 구성 성분을 분석한 결과, 발행 연도 2023년 기준의 로컬 소머즈 문서고 관련 지식 자산입니다. 분석 결과에 기반해 설계 검토 및 URS 사양 검증에 참고하시기 바랍니다.</w:t>
-        <w:br/>
-      </w:r>
-    </w:p>
-    <w:p>
-      <w:pPr>
-        <w:pStyle w:val="Heading2"/>
-      </w:pPr>
-      <w:r>
         <w:t>■ KoMA</w:t>
       </w:r>
     </w:p>
@@ -2453,60 +1841,6 @@
         <w:pStyle w:val="Heading2"/>
       </w:pPr>
       <w:r>
-        <w:t>■ NVIDIA_GTC_2026_전시회_참관_보고서</w:t>
-      </w:r>
-    </w:p>
-    <w:p>
-      <w:r>
-        <w:rPr>
-          <w:b/>
-        </w:rPr>
-        <w:t xml:space="preserve">• 출처 및 유형: </w:t>
-      </w:r>
-      <w:r>
-        <w:t>로컬 소머즈 문서고 (2026) | 기술 설계 문서</w:t>
-        <w:br/>
-      </w:r>
-      <w:r>
-        <w:rPr>
-          <w:b/>
-        </w:rPr>
-        <w:t>• 핵심 내용 요약:</w:t>
-        <w:br/>
-      </w:r>
-      <w:r>
-        <w:t xml:space="preserve">  NVIDIA GTC 2026 참관보고서  NVIDIA GPU Technology Conference1. NVIDIA GTC 2026 참관개요일정장소내용비고1일차03.14( •전시회명: NVIDIA GPU Technology Conference(NVIDIA GTC 2026) •장소: 미국캘리포니아산호세McEnery 컨벤션센...</w:t>
-        <w:br/>
-      </w:r>
-      <w:r>
-        <w:rPr>
-          <w:b/>
-        </w:rPr>
-        <w:t>• AI 학습용 핵심 Q&amp;A:</w:t>
-        <w:br/>
-      </w:r>
-      <w:r>
-        <w:t xml:space="preserve">  - Q: 'NVIDIA_GTC_2026_전시회_참관_보고서' 문서의 주요 목적과 핵심 요약은 무엇입니까?</w:t>
-        <w:br/>
-      </w:r>
-      <w:r>
-        <w:t xml:space="preserve">    A: 본 문서는 '기술 설계 문서' 유형으로 분류되며, 주요 요약 내용은 다음과 같습니다: NVIDIA GTC 2026 참관보고서  NVIDIA GPU Technology Conference1. NVIDIA GTC 2026 참관개요일정장소내용비고1일차03.14( •전시회명: NVIDIA GPU Technology Conference(NVIDIA GTC 2026) •장소: 미국캘리포니아산호세McEnery 컨벤션센...</w:t>
-        <w:br/>
-      </w:r>
-      <w:r>
-        <w:t xml:space="preserve">  - Q: 'NVIDIA_GTC_2026_전시회_참관_보고서' 문서에서 도출할 수 있는 실무 적용 포인트는 무엇입니까?</w:t>
-        <w:br/>
-      </w:r>
-      <w:r>
-        <w:t xml:space="preserve">    A: 문서의 텍스트 구성 성분을 분석한 결과, 발행 연도 2026년 기준의 로컬 소머즈 문서고 관련 지식 자산입니다. 분석 결과에 기반해 설계 검토 및 URS 사양 검증에 참고하시기 바랍니다.</w:t>
-        <w:br/>
-      </w:r>
-    </w:p>
-    <w:p>
-      <w:pPr>
-        <w:pStyle w:val="Heading2"/>
-      </w:pPr>
-      <w:r>
         <w:t>■ RAG</w:t>
       </w:r>
     </w:p>
@@ -2553,384 +1887,6 @@
       </w:r>
       <w:r>
         <w:t xml:space="preserve">    A: 문서의 텍스트 구성 성분을 분석한 결과, 발행 연도 2015년 기준의 로컬 소머즈 문서고 관련 지식 자산입니다. 분석 결과에 기반해 설계 검토 및 URS 사양 검증에 참고하시기 바랍니다.</w:t>
-        <w:br/>
-      </w:r>
-    </w:p>
-    <w:p>
-      <w:pPr>
-        <w:pStyle w:val="Heading2"/>
-      </w:pPr>
-      <w:r>
-        <w:t>■ 제1회_휴머노이드_테크콘(1st_Humanoid_Techcon)_주제별_핵심_요약_보고서</w:t>
-      </w:r>
-    </w:p>
-    <w:p>
-      <w:r>
-        <w:rPr>
-          <w:b/>
-        </w:rPr>
-        <w:t xml:space="preserve">• 출처 및 유형: </w:t>
-      </w:r>
-      <w:r>
-        <w:t>특허청 (2025) | 기술 설계 문서</w:t>
-        <w:br/>
-      </w:r>
-      <w:r>
-        <w:rPr>
-          <w:b/>
-        </w:rPr>
-        <w:t>• 핵심 내용 요약:</w:t>
-        <w:br/>
-      </w:r>
-      <w:r>
-        <w:t xml:space="preserve">  제1회 휴머노이드 테크콘(1st Humanoid Techcon) 주제별 핵심 요약  보고서  1. 휴머노이드 개발 철학: 신뢰와 교육의 패러다임  Boston Dynamics: ‘신뢰(Trust)’를 위한 설계 원칙  ●​ 환경 중심 설계(Human-centric Design)의 당위성:  휴머노이드의 존재 이유는  인간...</w:t>
-        <w:br/>
-      </w:r>
-      <w:r>
-        <w:rPr>
-          <w:b/>
-        </w:rPr>
-        <w:t>• AI 학습용 핵심 Q&amp;A:</w:t>
-        <w:br/>
-      </w:r>
-      <w:r>
-        <w:t xml:space="preserve">  - Q: '제1회_휴머노이드_테크콘(1st_Humanoid_Techcon)_주제별_핵심_요약_보고서' 문서의 주요 목적과 핵심 요약은 무엇입니까?</w:t>
-        <w:br/>
-      </w:r>
-      <w:r>
-        <w:t xml:space="preserve">    A: 본 문서는 '기술 설계 문서' 유형으로 분류되며, 주요 요약 내용은 다음과 같습니다: 제1회 휴머노이드 테크콘(1st Humanoid Techcon) 주제별 핵심 요약  보고서  1. 휴머노이드 개발 철학: 신뢰와 교육의 패러다임  Boston Dynamics: ‘신뢰(Trust)’를 위한 설계 원칙  ●​ 환경 중심 설계(Human-centric Design)의 당위성:  휴머노이드의 존재 이유는  인간...</w:t>
-        <w:br/>
-      </w:r>
-      <w:r>
-        <w:t xml:space="preserve">  - Q: '제1회_휴머노이드_테크콘(1st_Humanoid_Techcon)_주제별_핵심_요약_보고서' 문서에서 도출할 수 있는 실무 적용 포인트는 무엇입니까?</w:t>
-        <w:br/>
-      </w:r>
-      <w:r>
-        <w:t xml:space="preserve">    A: 문서의 텍스트 구성 성분을 분석한 결과, 발행 연도 2025년 기준의 특허청 관련 지식 자산입니다. 분석 결과에 기반해 설계 검토 및 URS 사양 검증에 참고하시기 바랍니다.</w:t>
-        <w:br/>
-      </w:r>
-    </w:p>
-    <w:p>
-      <w:pPr>
-        <w:pStyle w:val="Heading2"/>
-      </w:pPr>
-      <w:r>
-        <w:t>■ 2026 인터팩 참관 내용(NSE)</w:t>
-      </w:r>
-    </w:p>
-    <w:p>
-      <w:r>
-        <w:rPr>
-          <w:b/>
-        </w:rPr>
-        <w:t xml:space="preserve">• 출처 및 유형: </w:t>
-      </w:r>
-      <w:r>
-        <w:t>로컬 소머즈 문서고 (2025) | 정부·공공기관 보고서</w:t>
-        <w:br/>
-      </w:r>
-      <w:r>
-        <w:rPr>
-          <w:b/>
-        </w:rPr>
-        <w:t>• 핵심 내용 요약:</w:t>
-        <w:br/>
-      </w:r>
-      <w:r>
-        <w:t xml:space="preserve">  Interpack _ 개요 ■ Interpack 참석 ` 스마트 자동화 • 편의성 중심 자동화   - 로봇 &amp; AI 부자재 자동 공급• 고속 포장설비 (다품종, 대량생산) 고속화·유연화·작업 편의성을 중심으로 한 포장 자동화 Interpack _ 키워드 부자재 공급   1. 수작업 부자재 공급에 따른 작업자 상시 개입 및...</w:t>
-        <w:br/>
-      </w:r>
-      <w:r>
-        <w:rPr>
-          <w:b/>
-        </w:rPr>
-        <w:t>• AI 학습용 핵심 Q&amp;A:</w:t>
-        <w:br/>
-      </w:r>
-      <w:r>
-        <w:t xml:space="preserve">  - Q: '2026 인터팩 참관 내용(NSE)' 문서의 주요 목적과 핵심 요약은 무엇입니까?</w:t>
-        <w:br/>
-      </w:r>
-      <w:r>
-        <w:t xml:space="preserve">    A: 본 문서는 '정부·공공기관 보고서' 유형으로 분류되며, 주요 요약 내용은 다음과 같습니다: Interpack _ 개요 ■ Interpack 참석 ` 스마트 자동화 • 편의성 중심 자동화   - 로봇 &amp; AI 부자재 자동 공급• 고속 포장설비 (다품종, 대량생산) 고속화·유연화·작업 편의성을 중심으로 한 포장 자동화 Interpack _ 키워드 부자재 공급   1. 수작업 부자재 공급에 따른 작업자 상시 개입 및...</w:t>
-        <w:br/>
-      </w:r>
-      <w:r>
-        <w:t xml:space="preserve">  - Q: '2026 인터팩 참관 내용(NSE)' 문서에서 도출할 수 있는 실무 적용 포인트는 무엇입니까?</w:t>
-        <w:br/>
-      </w:r>
-      <w:r>
-        <w:t xml:space="preserve">    A: 문서의 텍스트 구성 성분을 분석한 결과, 발행 연도 2025년 기준의 로컬 소머즈 문서고 관련 지식 자산입니다. 분석 결과에 기반해 설계 검토 및 URS 사양 검증에 참고하시기 바랍니다.</w:t>
-        <w:br/>
-      </w:r>
-    </w:p>
-    <w:p>
-      <w:pPr>
-        <w:pStyle w:val="Heading2"/>
-      </w:pPr>
-      <w:r>
-        <w:t>■ MCP</w:t>
-      </w:r>
-    </w:p>
-    <w:p>
-      <w:r>
-        <w:rPr>
-          <w:b/>
-        </w:rPr>
-        <w:t xml:space="preserve">• 출처 및 유형: </w:t>
-      </w:r>
-      <w:r>
-        <w:t>로컬 소머즈 문서고 (2024) | 기술 설계 문서</w:t>
-        <w:br/>
-      </w:r>
-      <w:r>
-        <w:rPr>
-          <w:b/>
-        </w:rPr>
-        <w:t>• 핵심 내용 요약:</w:t>
-        <w:br/>
-      </w:r>
-      <w:r>
-        <w:t xml:space="preserve">  MCP(모델 컨텍스트 프로토콜)란 무엇인가? 작동 원리 주요 생태계 구성원 관련 기술과의 비교 (AI 엔지니어를 위한 심층 분석) Notion MCP 서버란 무엇인가? 두 가지 형태 작동 아키텍처 Notion MCP 서버의 핵심 기능 (Key Features) Notion MCP 서버 사용 방법 (단계별 설정 가이드) 1...</w:t>
-        <w:br/>
-      </w:r>
-      <w:r>
-        <w:rPr>
-          <w:b/>
-        </w:rPr>
-        <w:t>• AI 학습용 핵심 Q&amp;A:</w:t>
-        <w:br/>
-      </w:r>
-      <w:r>
-        <w:t xml:space="preserve">  - Q: 'MCP' 문서의 주요 목적과 핵심 요약은 무엇입니까?</w:t>
-        <w:br/>
-      </w:r>
-      <w:r>
-        <w:t xml:space="preserve">    A: 본 문서는 '기술 설계 문서' 유형으로 분류되며, 주요 요약 내용은 다음과 같습니다: MCP(모델 컨텍스트 프로토콜)란 무엇인가? 작동 원리 주요 생태계 구성원 관련 기술과의 비교 (AI 엔지니어를 위한 심층 분석) Notion MCP 서버란 무엇인가? 두 가지 형태 작동 아키텍처 Notion MCP 서버의 핵심 기능 (Key Features) Notion MCP 서버 사용 방법 (단계별 설정 가이드) 1...</w:t>
-        <w:br/>
-      </w:r>
-      <w:r>
-        <w:t xml:space="preserve">  - Q: 'MCP' 문서에서 도출할 수 있는 실무 적용 포인트는 무엇입니까?</w:t>
-        <w:br/>
-      </w:r>
-      <w:r>
-        <w:t xml:space="preserve">    A: 문서의 텍스트 구성 성분을 분석한 결과, 발행 연도 2024년 기준의 로컬 소머즈 문서고 관련 지식 자산입니다. 분석 결과에 기반해 설계 검토 및 URS 사양 검증에 참고하시기 바랍니다.</w:t>
-        <w:br/>
-      </w:r>
-    </w:p>
-    <w:p>
-      <w:pPr>
-        <w:pStyle w:val="Heading2"/>
-      </w:pPr>
-      <w:r>
-        <w:t>■ NVIDIA_GTC_2026_시행계획서</w:t>
-      </w:r>
-    </w:p>
-    <w:p>
-      <w:r>
-        <w:rPr>
-          <w:b/>
-        </w:rPr>
-        <w:t xml:space="preserve">• 출처 및 유형: </w:t>
-      </w:r>
-      <w:r>
-        <w:t>로컬 소머즈 문서고 (2026) | 학술 논문</w:t>
-        <w:br/>
-      </w:r>
-      <w:r>
-        <w:rPr>
-          <w:b/>
-        </w:rPr>
-        <w:t>• 핵심 내용 요약:</w:t>
-        <w:br/>
-      </w:r>
-      <w:r>
-        <w:t xml:space="preserve">  NVIDIA GTC 2026 참관에 따른 스마트팩토리 기술 도입 시행 계획서 일자: 2026년 6월 17일 보고부서: 스마트팩토리팀 작성자: SomersAgent (지식 관리 시스템) 1. 개요 및 추진 목적 본 계획서는 NVIDIA GTC 2026 전시회 참관을 통해 확인된 핵심 기술 트렌드(Physical AI, Ag...</w:t>
-        <w:br/>
-      </w:r>
-      <w:r>
-        <w:rPr>
-          <w:b/>
-        </w:rPr>
-        <w:t>• AI 학습용 핵심 Q&amp;A:</w:t>
-        <w:br/>
-      </w:r>
-      <w:r>
-        <w:t xml:space="preserve">  - Q: 'NVIDIA_GTC_2026_시행계획서' 문서의 주요 목적과 핵심 요약은 무엇입니까?</w:t>
-        <w:br/>
-      </w:r>
-      <w:r>
-        <w:t xml:space="preserve">    A: 본 문서는 '학술 논문' 유형으로 분류되며, 주요 요약 내용은 다음과 같습니다: NVIDIA GTC 2026 참관에 따른 스마트팩토리 기술 도입 시행 계획서 일자: 2026년 6월 17일 보고부서: 스마트팩토리팀 작성자: SomersAgent (지식 관리 시스템) 1. 개요 및 추진 목적 본 계획서는 NVIDIA GTC 2026 전시회 참관을 통해 확인된 핵심 기술 트렌드(Physical AI, Ag...</w:t>
-        <w:br/>
-      </w:r>
-      <w:r>
-        <w:t xml:space="preserve">  - Q: 'NVIDIA_GTC_2026_시행계획서' 문서에서 도출할 수 있는 실무 적용 포인트는 무엇입니까?</w:t>
-        <w:br/>
-      </w:r>
-      <w:r>
-        <w:t xml:space="preserve">    A: 문서의 텍스트 구성 성분을 분석한 결과, 발행 연도 2026년 기준의 로컬 소머즈 문서고 관련 지식 자산입니다. 분석 결과에 기반해 설계 검토 및 URS 사양 검증에 참고하시기 바랍니다.</w:t>
-        <w:br/>
-      </w:r>
-    </w:p>
-    <w:p>
-      <w:pPr>
-        <w:pStyle w:val="Heading2"/>
-      </w:pPr>
-      <w:r>
-        <w:t>■ 로봇전문가로또</w:t>
-      </w:r>
-    </w:p>
-    <w:p>
-      <w:r>
-        <w:rPr>
-          <w:b/>
-        </w:rPr>
-        <w:t xml:space="preserve">• 출처 및 유형: </w:t>
-      </w:r>
-      <w:r>
-        <w:t>로컬 소머즈 문서고 (2024) | 학술 논문</w:t>
-        <w:br/>
-      </w:r>
-      <w:r>
-        <w:rPr>
-          <w:b/>
-        </w:rPr>
-        <w:t>• 핵심 내용 요약:</w:t>
-        <w:br/>
-      </w:r>
-      <w:r>
-        <w:t xml:space="preserve">  아래는 요청하신 범위를 모두 반영한 **“산업용 로봇 + 센서융합 + AI 접목기술 실무 전문가 프롬프트”**입니다. 2026년 기준 핵심 방향은 AI·자율성, IT/OT 융합, 휴머노이드 신뢰성 검증, 디지털트윈·시뮬레이션, 비전·센서 기반 로봇 지능화로 정리할 수 있습니다. IFR는 2026년 로봇 트렌드로 AI &amp; ...</w:t>
-        <w:br/>
-      </w:r>
-      <w:r>
-        <w:rPr>
-          <w:b/>
-        </w:rPr>
-        <w:t>• AI 학습용 핵심 Q&amp;A:</w:t>
-        <w:br/>
-      </w:r>
-      <w:r>
-        <w:t xml:space="preserve">  - Q: '로봇전문가로또' 문서의 주요 목적과 핵심 요약은 무엇입니까?</w:t>
-        <w:br/>
-      </w:r>
-      <w:r>
-        <w:t xml:space="preserve">    A: 본 문서는 '학술 논문' 유형으로 분류되며, 주요 요약 내용은 다음과 같습니다: 아래는 요청하신 범위를 모두 반영한 **“산업용 로봇 + 센서융합 + AI 접목기술 실무 전문가 프롬프트”**입니다. 2026년 기준 핵심 방향은 AI·자율성, IT/OT 융합, 휴머노이드 신뢰성 검증, 디지털트윈·시뮬레이션, 비전·센서 기반 로봇 지능화로 정리할 수 있습니다. IFR는 2026년 로봇 트렌드로 AI &amp; ...</w:t>
-        <w:br/>
-      </w:r>
-      <w:r>
-        <w:t xml:space="preserve">  - Q: '로봇전문가로또' 문서에서 도출할 수 있는 실무 적용 포인트는 무엇입니까?</w:t>
-        <w:br/>
-      </w:r>
-      <w:r>
-        <w:t xml:space="preserve">    A: 문서의 텍스트 구성 성분을 분석한 결과, 발행 연도 2024년 기준의 로컬 소머즈 문서고 관련 지식 자산입니다. 분석 결과에 기반해 설계 검토 및 URS 사양 검증에 참고하시기 바랍니다.</w:t>
-        <w:br/>
-      </w:r>
-    </w:p>
-    <w:p>
-      <w:pPr>
-        <w:pStyle w:val="Heading2"/>
-      </w:pPr>
-      <w:r>
-        <w:t>■ 문서검색 전문가</w:t>
-      </w:r>
-    </w:p>
-    <w:p>
-      <w:r>
-        <w:rPr>
-          <w:b/>
-        </w:rPr>
-        <w:t xml:space="preserve">• 출처 및 유형: </w:t>
-      </w:r>
-      <w:r>
-        <w:t>학술지 DB (2026) | 학술 논문</w:t>
-        <w:br/>
-      </w:r>
-      <w:r>
-        <w:rPr>
-          <w:b/>
-        </w:rPr>
-        <w:t>• 핵심 내용 요약:</w:t>
-        <w:br/>
-      </w:r>
-      <w:r>
-        <w:t xml:space="preserve">  “출처가 분명한 전문지식·논문·보고서·PDF·MS Office·Google 문서 등을 정확히 찾아주는 전문가 페르소나 프롬프트” 초안입니다. Gemini, ChatGPT, Perplexity, NotebookLM, Google AI Studio, 사내 AI 에이전트에 그대로 넣어 사용할 수 있습니다. 전문지식·논문·보고서...</w:t>
-        <w:br/>
-      </w:r>
-      <w:r>
-        <w:rPr>
-          <w:b/>
-        </w:rPr>
-        <w:t>• AI 학습용 핵심 Q&amp;A:</w:t>
-        <w:br/>
-      </w:r>
-      <w:r>
-        <w:t xml:space="preserve">  - Q: '문서검색 전문가' 문서의 주요 목적과 핵심 요약은 무엇입니까?</w:t>
-        <w:br/>
-      </w:r>
-      <w:r>
-        <w:t xml:space="preserve">    A: 본 문서는 '학술 논문' 유형으로 분류되며, 주요 요약 내용은 다음과 같습니다: “출처가 분명한 전문지식·논문·보고서·PDF·MS Office·Google 문서 등을 정확히 찾아주는 전문가 페르소나 프롬프트” 초안입니다. Gemini, ChatGPT, Perplexity, NotebookLM, Google AI Studio, 사내 AI 에이전트에 그대로 넣어 사용할 수 있습니다. 전문지식·논문·보고서...</w:t>
-        <w:br/>
-      </w:r>
-      <w:r>
-        <w:t xml:space="preserve">  - Q: '문서검색 전문가' 문서에서 도출할 수 있는 실무 적용 포인트는 무엇입니까?</w:t>
-        <w:br/>
-      </w:r>
-      <w:r>
-        <w:t xml:space="preserve">    A: 문서의 텍스트 구성 성분을 분석한 결과, 발행 연도 2026년 기준의 학술지 DB 관련 지식 자산입니다. 분석 결과에 기반해 설계 검토 및 URS 사양 검증에 참고하시기 바랍니다.</w:t>
-        <w:br/>
-      </w:r>
-    </w:p>
-    <w:p>
-      <w:pPr>
-        <w:pStyle w:val="Heading2"/>
-      </w:pPr>
-      <w:r>
-        <w:t>■ 구조 개편 테스트에 관한 산업 동향 및 학술 보고서</w:t>
-      </w:r>
-    </w:p>
-    <w:p>
-      <w:r>
-        <w:rPr>
-          <w:b/>
-        </w:rPr>
-        <w:t xml:space="preserve">• 출처 및 유형: </w:t>
-      </w:r>
-      <w:r>
-        <w:t>한국학술지인용색인 (KCI) (2024) | 학술 논문</w:t>
-        <w:br/>
-      </w:r>
-      <w:r>
-        <w:rPr>
-          <w:b/>
-        </w:rPr>
-        <w:t>• 핵심 내용 요약:</w:t>
-        <w:br/>
-      </w:r>
-      <w:r>
-        <w:t xml:space="preserve">  구조 개편 테스트의 기초 기술 분석과 최신 적용 표준 분석 내용.</w:t>
-        <w:br/>
-      </w:r>
-      <w:r>
-        <w:rPr>
-          <w:b/>
-        </w:rPr>
-        <w:t>• AI 학습용 핵심 Q&amp;A:</w:t>
-        <w:br/>
-      </w:r>
-      <w:r>
-        <w:t xml:space="preserve">  - Q: 구조 개편 테스트에 관한 산업 동향 및 학술 보고서의 핵심 설계/검토 기준은 무엇입니까?</w:t>
-        <w:br/>
-      </w:r>
-      <w:r>
-        <w:t xml:space="preserve">    A: 실무 적용 포인트 및 핵심 기술 사양이 요약됨.</w:t>
-        <w:br/>
-      </w:r>
-      <w:r>
-        <w:t xml:space="preserve">  - Q: 구조 개편 테스트에 관한 산업 동향 및 학술 보고서 문서의 신뢰성과 출처 정보는 어떻게 됩니까?</w:t>
-        <w:br/>
-      </w:r>
-      <w:r>
-        <w:t xml:space="preserve">    A: 본 문서는 2024년 한국학술지인용색인 (KCI)에서 발행된 학술 논문로, 신뢰도 등급은 ★★★★☆ 입니다.</w:t>
         <w:br/>
       </w:r>
     </w:p>

</xml_diff>